<commit_message>
Kilavuz: Bolum 6 alt basliklarini gercek baslik stiline cevir (gezinme icin)
Co-Authored-By: Claude Opus 5 (1M context) <noreply@anthropic.com>
</commit_message>
<xml_diff>
--- a/docs/Buke_ANLAMA_ve_ANLATMA_Kilavuzu.docx
+++ b/docs/Buke_ANLAMA_ve_ANLATMA_Kilavuzu.docx
@@ -11844,15 +11844,9 @@
     </w:p>
     <w:p>
       <w:pPr>
-        <w:spacing w:after="40"/>
-      </w:pPr>
-      <w:r>
-        <w:rPr>
-          <w:b/>
-          <w:i w:val="0"/>
-          <w:color w:val="C10F1E"/>
-          <w:sz w:val="22"/>
-        </w:rPr>
+        <w:pStyle w:val="Heading2"/>
+      </w:pPr>
+      <w:r>
         <w:t>6.1  Neden Python?</w:t>
       </w:r>
     </w:p>
@@ -12168,15 +12162,9 @@
     </w:p>
     <w:p>
       <w:pPr>
-        <w:spacing w:after="40"/>
-      </w:pPr>
-      <w:r>
-        <w:rPr>
-          <w:b/>
-          <w:i w:val="0"/>
-          <w:color w:val="C10F1E"/>
-          <w:sz w:val="22"/>
-        </w:rPr>
+        <w:pStyle w:val="Heading2"/>
+      </w:pPr>
+      <w:r>
         <w:t>6.2  Neden Pyomo? Doğrudan çözücü API'si kullanılamaz mıydı?</w:t>
       </w:r>
     </w:p>
@@ -13011,15 +12999,9 @@
     </w:p>
     <w:p>
       <w:pPr>
-        <w:spacing w:after="40"/>
-      </w:pPr>
-      <w:r>
-        <w:rPr>
-          <w:b/>
-          <w:i w:val="0"/>
-          <w:color w:val="C10F1E"/>
-          <w:sz w:val="22"/>
-        </w:rPr>
+        <w:pStyle w:val="Heading2"/>
+      </w:pPr>
+      <w:r>
         <w:t>6.4  Neden MIP? Genetik algoritma veya sezgisel yöntem neden değil?</w:t>
       </w:r>
     </w:p>
@@ -13372,15 +13354,9 @@
     </w:p>
     <w:p>
       <w:pPr>
-        <w:spacing w:after="40"/>
-      </w:pPr>
-      <w:r>
-        <w:rPr>
-          <w:b/>
-          <w:i w:val="0"/>
-          <w:color w:val="C10F1E"/>
-          <w:sz w:val="22"/>
-        </w:rPr>
+        <w:pStyle w:val="Heading2"/>
+      </w:pPr>
+      <w:r>
         <w:t>6.5  Neden pencere ±60 dakika? Daha geniş olsa daha iyi olmaz mıydı?</w:t>
       </w:r>
     </w:p>
@@ -13455,15 +13431,9 @@
     </w:p>
     <w:p>
       <w:pPr>
-        <w:spacing w:after="40"/>
-      </w:pPr>
-      <w:r>
-        <w:rPr>
-          <w:b/>
-          <w:i w:val="0"/>
-          <w:color w:val="C10F1E"/>
-          <w:sz w:val="22"/>
-        </w:rPr>
+        <w:pStyle w:val="Heading2"/>
+      </w:pPr>
+      <w:r>
         <w:t>6.6  Neden problemi güne göre böldük?</w:t>
       </w:r>
     </w:p>
@@ -13538,15 +13508,9 @@
     </w:p>
     <w:p>
       <w:pPr>
-        <w:spacing w:after="40"/>
-      </w:pPr>
-      <w:r>
-        <w:rPr>
-          <w:b/>
-          <w:i w:val="0"/>
-          <w:color w:val="C10F1E"/>
-          <w:sz w:val="22"/>
-        </w:rPr>
+        <w:pStyle w:val="Heading2"/>
+      </w:pPr>
+      <w:r>
         <w:t>6.7  Neden şartnamede olmayan bir ceza terimi eklediniz?</w:t>
       </w:r>
     </w:p>
@@ -13658,15 +13622,9 @@
     </w:p>
     <w:p>
       <w:pPr>
-        <w:spacing w:after="40"/>
-      </w:pPr>
-      <w:r>
-        <w:rPr>
-          <w:b/>
-          <w:i w:val="0"/>
-          <w:color w:val="C10F1E"/>
-          <w:sz w:val="22"/>
-        </w:rPr>
+        <w:pStyle w:val="Heading2"/>
+      </w:pPr>
+      <w:r>
         <w:t>6.8  E2 kısıtını neden kapattınız?</w:t>
       </w:r>
     </w:p>
@@ -13755,15 +13713,9 @@
     </w:p>
     <w:p>
       <w:pPr>
-        <w:spacing w:after="40"/>
-      </w:pPr>
-      <w:r>
-        <w:rPr>
-          <w:b/>
-          <w:i w:val="0"/>
-          <w:color w:val="C10F1E"/>
-          <w:sz w:val="22"/>
-        </w:rPr>
+        <w:pStyle w:val="Heading2"/>
+      </w:pPr>
+      <w:r>
         <w:t>6.9  B2 kısıtını neden kapattınız?</w:t>
       </w:r>
     </w:p>
@@ -13852,15 +13804,9 @@
     </w:p>
     <w:p>
       <w:pPr>
-        <w:spacing w:after="40"/>
-      </w:pPr>
-      <w:r>
-        <w:rPr>
-          <w:b/>
-          <w:i w:val="0"/>
-          <w:color w:val="C10F1E"/>
-          <w:sz w:val="22"/>
-        </w:rPr>
+        <w:pStyle w:val="Heading2"/>
+      </w:pPr>
+      <w:r>
         <w:t>6.10  Neden ayrı bir doğrulayıcı yazdınız? Kendi kodunuza güvenmiyor musunuz?</w:t>
       </w:r>
     </w:p>
@@ -13949,15 +13895,9 @@
     </w:p>
     <w:p>
       <w:pPr>
-        <w:spacing w:after="40"/>
-      </w:pPr>
-      <w:r>
-        <w:rPr>
-          <w:b/>
-          <w:i w:val="0"/>
-          <w:color w:val="C10F1E"/>
-          <w:sz w:val="22"/>
-        </w:rPr>
+        <w:pStyle w:val="Heading2"/>
+      </w:pPr>
+      <w:r>
         <w:t>6.11  Neden threads=1 ve mip_gap=%0,1?</w:t>
       </w:r>
     </w:p>

</xml_diff>